<commit_message>
fix: adaptation auto-dark R/Python via auto-dark-setup.R et correction deploiement GitHub Pages/CI
</commit_message>
<xml_diff>
--- a/docs/exemple-article.docx
+++ b/docs/exemple-article.docx
@@ -4321,7 +4321,7 @@
         <w:rPr>
           <w:rStyle w:val="FunctionTok"/>
         </w:rPr>
-        <w:t xml:space="preserve">scale_color_manual</w:t>
+        <w:t xml:space="preserve">scale_x_continuous</w:t>
       </w:r>
       <w:r>
         <w:rPr>
@@ -4333,7 +4333,55 @@
         <w:rPr>
           <w:rStyle w:val="AttributeTok"/>
         </w:rPr>
-        <w:t xml:space="preserve">values =</w:t>
+        <w:t xml:space="preserve">breaks =</w:t>
+      </w:r>
+      <w:r>
+        <w:rPr>
+          <w:rStyle w:val="NormalTok"/>
+        </w:rPr>
+        <w:t xml:space="preserve"> temps) </w:t>
+      </w:r>
+      <w:r>
+        <w:rPr>
+          <w:rStyle w:val="SpecialCharTok"/>
+        </w:rPr>
+        <w:t xml:space="preserve">+</w:t>
+      </w:r>
+      <w:r>
+        <w:br/>
+      </w:r>
+      <w:r>
+        <w:rPr>
+          <w:rStyle w:val="NormalTok"/>
+        </w:rPr>
+        <w:t xml:space="preserve">  </w:t>
+      </w:r>
+      <w:r>
+        <w:rPr>
+          <w:rStyle w:val="FunctionTok"/>
+        </w:rPr>
+        <w:t xml:space="preserve">labs</w:t>
+      </w:r>
+      <w:r>
+        <w:rPr>
+          <w:rStyle w:val="NormalTok"/>
+        </w:rPr>
+        <w:t xml:space="preserve">(</w:t>
+      </w:r>
+      <w:r>
+        <w:br/>
+      </w:r>
+      <w:r>
+        <w:rPr>
+          <w:rStyle w:val="NormalTok"/>
+        </w:rPr>
+        <w:t xml:space="preserve">    </w:t>
+      </w:r>
+      <w:r>
+        <w:rPr>
+          <w:rStyle w:val="AttributeTok"/>
+        </w:rPr>
+        <w:t xml:space="preserve">x =</w:t>
       </w:r>
       <w:r>
         <w:rPr>
@@ -4343,9 +4391,105 @@
       </w:r>
       <w:r>
         <w:rPr>
+          <w:rStyle w:val="StringTok"/>
+        </w:rPr>
+        <w:t xml:space="preserve">"Temps de perfusion (heures)"</w:t>
+      </w:r>
+      <w:r>
+        <w:rPr>
+          <w:rStyle w:val="NormalTok"/>
+        </w:rPr>
+        <w:t xml:space="preserve">,</w:t>
+      </w:r>
+      <w:r>
+        <w:br/>
+      </w:r>
+      <w:r>
+        <w:rPr>
+          <w:rStyle w:val="NormalTok"/>
+        </w:rPr>
+        <w:t xml:space="preserve">    </w:t>
+      </w:r>
+      <w:r>
+        <w:rPr>
+          <w:rStyle w:val="AttributeTok"/>
+        </w:rPr>
+        <w:t xml:space="preserve">y =</w:t>
+      </w:r>
+      <w:r>
+        <w:rPr>
+          <w:rStyle w:val="NormalTok"/>
+        </w:rPr>
+        <w:t xml:space="preserve"> </w:t>
+      </w:r>
+      <w:r>
+        <w:rPr>
+          <w:rStyle w:val="StringTok"/>
+        </w:rPr>
+        <w:t xml:space="preserve">"Lactatémie moyenne (mmol/L)"</w:t>
+      </w:r>
+      <w:r>
+        <w:rPr>
+          <w:rStyle w:val="NormalTok"/>
+        </w:rPr>
+        <w:t xml:space="preserve">,</w:t>
+      </w:r>
+      <w:r>
+        <w:br/>
+      </w:r>
+      <w:r>
+        <w:rPr>
+          <w:rStyle w:val="NormalTok"/>
+        </w:rPr>
+        <w:t xml:space="preserve">    </w:t>
+      </w:r>
+      <w:r>
+        <w:rPr>
+          <w:rStyle w:val="AttributeTok"/>
+        </w:rPr>
+        <w:t xml:space="preserve">color =</w:t>
+      </w:r>
+      <w:r>
+        <w:rPr>
+          <w:rStyle w:val="NormalTok"/>
+        </w:rPr>
+        <w:t xml:space="preserve"> </w:t>
+      </w:r>
+      <w:r>
+        <w:rPr>
+          <w:rStyle w:val="StringTok"/>
+        </w:rPr>
+        <w:t xml:space="preserve">"Protocole"</w:t>
+      </w:r>
+      <w:r>
+        <w:br/>
+      </w:r>
+      <w:r>
+        <w:rPr>
+          <w:rStyle w:val="NormalTok"/>
+        </w:rPr>
+        <w:t xml:space="preserve">  ) </w:t>
+      </w:r>
+      <w:r>
+        <w:rPr>
+          <w:rStyle w:val="SpecialCharTok"/>
+        </w:rPr>
+        <w:t xml:space="preserve">+</w:t>
+      </w:r>
+      <w:r>
+        <w:br/>
+      </w:r>
+      <w:r>
+        <w:rPr>
+          <w:rStyle w:val="NormalTok"/>
+        </w:rPr>
+        <w:t xml:space="preserve">  </w:t>
+      </w:r>
+      <w:r>
+        <w:rPr>
           <w:rStyle w:val="FunctionTok"/>
         </w:rPr>
-        <w:t xml:space="preserve">c</w:t>
+        <w:t xml:space="preserve">theme_minimal</w:t>
       </w:r>
       <w:r>
         <w:rPr>
@@ -4355,9 +4499,9 @@
       </w:r>
       <w:r>
         <w:rPr>
-          <w:rStyle w:val="StringTok"/>
-        </w:rPr>
-        <w:t xml:space="preserve">"Protocole Optimisé"</w:t>
+          <w:rStyle w:val="AttributeTok"/>
+        </w:rPr>
+        <w:t xml:space="preserve">base_size =</w:t>
       </w:r>
       <w:r>
         <w:rPr>
@@ -4367,63 +4511,15 @@
       </w:r>
       <w:r>
         <w:rPr>
-          <w:rStyle w:val="OtherTok"/>
-        </w:rPr>
-        <w:t xml:space="preserve">=</w:t>
-      </w:r>
-      <w:r>
-        <w:rPr>
-          <w:rStyle w:val="NormalTok"/>
-        </w:rPr>
-        <w:t xml:space="preserve"> </w:t>
-      </w:r>
-      <w:r>
-        <w:rPr>
-          <w:rStyle w:val="StringTok"/>
-        </w:rPr>
-        <w:t xml:space="preserve">"#17365D"</w:t>
-      </w:r>
-      <w:r>
-        <w:rPr>
-          <w:rStyle w:val="NormalTok"/>
-        </w:rPr>
-        <w:t xml:space="preserve">, </w:t>
-      </w:r>
-      <w:r>
-        <w:rPr>
-          <w:rStyle w:val="StringTok"/>
-        </w:rPr>
-        <w:t xml:space="preserve">"Protocole Standard"</w:t>
-      </w:r>
-      <w:r>
-        <w:rPr>
-          <w:rStyle w:val="NormalTok"/>
-        </w:rPr>
-        <w:t xml:space="preserve"> </w:t>
-      </w:r>
-      <w:r>
-        <w:rPr>
-          <w:rStyle w:val="OtherTok"/>
-        </w:rPr>
-        <w:t xml:space="preserve">=</w:t>
-      </w:r>
-      <w:r>
-        <w:rPr>
-          <w:rStyle w:val="NormalTok"/>
-        </w:rPr>
-        <w:t xml:space="preserve"> </w:t>
-      </w:r>
-      <w:r>
-        <w:rPr>
-          <w:rStyle w:val="StringTok"/>
-        </w:rPr>
-        <w:t xml:space="preserve">"#61afef"</w:t>
-      </w:r>
-      <w:r>
-        <w:rPr>
-          <w:rStyle w:val="NormalTok"/>
-        </w:rPr>
-        <w:t xml:space="preserve">)) </w:t>
+          <w:rStyle w:val="DecValTok"/>
+        </w:rPr>
+        <w:t xml:space="preserve">12</w:t>
+      </w:r>
+      <w:r>
+        <w:rPr>
+          <w:rStyle w:val="NormalTok"/>
+        </w:rPr>
+        <w:t xml:space="preserve">) </w:t>
       </w:r>
       <w:r>
         <w:rPr>
@@ -4444,394 +4540,13 @@
         <w:rPr>
           <w:rStyle w:val="FunctionTok"/>
         </w:rPr>
-        <w:t xml:space="preserve">scale_x_continuous</w:t>
+        <w:t xml:space="preserve">theme</w:t>
       </w:r>
       <w:r>
         <w:rPr>
           <w:rStyle w:val="NormalTok"/>
         </w:rPr>
         <w:t xml:space="preserve">(</w:t>
-      </w:r>
-      <w:r>
-        <w:rPr>
-          <w:rStyle w:val="AttributeTok"/>
-        </w:rPr>
-        <w:t xml:space="preserve">breaks =</w:t>
-      </w:r>
-      <w:r>
-        <w:rPr>
-          <w:rStyle w:val="NormalTok"/>
-        </w:rPr>
-        <w:t xml:space="preserve"> temps) </w:t>
-      </w:r>
-      <w:r>
-        <w:rPr>
-          <w:rStyle w:val="SpecialCharTok"/>
-        </w:rPr>
-        <w:t xml:space="preserve">+</w:t>
-      </w:r>
-      <w:r>
-        <w:br/>
-      </w:r>
-      <w:r>
-        <w:rPr>
-          <w:rStyle w:val="NormalTok"/>
-        </w:rPr>
-        <w:t xml:space="preserve">  </w:t>
-      </w:r>
-      <w:r>
-        <w:rPr>
-          <w:rStyle w:val="FunctionTok"/>
-        </w:rPr>
-        <w:t xml:space="preserve">labs</w:t>
-      </w:r>
-      <w:r>
-        <w:rPr>
-          <w:rStyle w:val="NormalTok"/>
-        </w:rPr>
-        <w:t xml:space="preserve">(</w:t>
-      </w:r>
-      <w:r>
-        <w:br/>
-      </w:r>
-      <w:r>
-        <w:rPr>
-          <w:rStyle w:val="NormalTok"/>
-        </w:rPr>
-        <w:t xml:space="preserve">    </w:t>
-      </w:r>
-      <w:r>
-        <w:rPr>
-          <w:rStyle w:val="AttributeTok"/>
-        </w:rPr>
-        <w:t xml:space="preserve">x =</w:t>
-      </w:r>
-      <w:r>
-        <w:rPr>
-          <w:rStyle w:val="NormalTok"/>
-        </w:rPr>
-        <w:t xml:space="preserve"> </w:t>
-      </w:r>
-      <w:r>
-        <w:rPr>
-          <w:rStyle w:val="StringTok"/>
-        </w:rPr>
-        <w:t xml:space="preserve">"Temps de perfusion (heures)"</w:t>
-      </w:r>
-      <w:r>
-        <w:rPr>
-          <w:rStyle w:val="NormalTok"/>
-        </w:rPr>
-        <w:t xml:space="preserve">,</w:t>
-      </w:r>
-      <w:r>
-        <w:br/>
-      </w:r>
-      <w:r>
-        <w:rPr>
-          <w:rStyle w:val="NormalTok"/>
-        </w:rPr>
-        <w:t xml:space="preserve">    </w:t>
-      </w:r>
-      <w:r>
-        <w:rPr>
-          <w:rStyle w:val="AttributeTok"/>
-        </w:rPr>
-        <w:t xml:space="preserve">y =</w:t>
-      </w:r>
-      <w:r>
-        <w:rPr>
-          <w:rStyle w:val="NormalTok"/>
-        </w:rPr>
-        <w:t xml:space="preserve"> </w:t>
-      </w:r>
-      <w:r>
-        <w:rPr>
-          <w:rStyle w:val="StringTok"/>
-        </w:rPr>
-        <w:t xml:space="preserve">"Lactatémie moyenne (mmol/L)"</w:t>
-      </w:r>
-      <w:r>
-        <w:rPr>
-          <w:rStyle w:val="NormalTok"/>
-        </w:rPr>
-        <w:t xml:space="preserve">,</w:t>
-      </w:r>
-      <w:r>
-        <w:br/>
-      </w:r>
-      <w:r>
-        <w:rPr>
-          <w:rStyle w:val="NormalTok"/>
-        </w:rPr>
-        <w:t xml:space="preserve">    </w:t>
-      </w:r>
-      <w:r>
-        <w:rPr>
-          <w:rStyle w:val="AttributeTok"/>
-        </w:rPr>
-        <w:t xml:space="preserve">color =</w:t>
-      </w:r>
-      <w:r>
-        <w:rPr>
-          <w:rStyle w:val="NormalTok"/>
-        </w:rPr>
-        <w:t xml:space="preserve"> </w:t>
-      </w:r>
-      <w:r>
-        <w:rPr>
-          <w:rStyle w:val="StringTok"/>
-        </w:rPr>
-        <w:t xml:space="preserve">"Protocole"</w:t>
-      </w:r>
-      <w:r>
-        <w:br/>
-      </w:r>
-      <w:r>
-        <w:rPr>
-          <w:rStyle w:val="NormalTok"/>
-        </w:rPr>
-        <w:t xml:space="preserve">  ) </w:t>
-      </w:r>
-      <w:r>
-        <w:rPr>
-          <w:rStyle w:val="SpecialCharTok"/>
-        </w:rPr>
-        <w:t xml:space="preserve">+</w:t>
-      </w:r>
-      <w:r>
-        <w:br/>
-      </w:r>
-      <w:r>
-        <w:rPr>
-          <w:rStyle w:val="NormalTok"/>
-        </w:rPr>
-        <w:t xml:space="preserve">  </w:t>
-      </w:r>
-      <w:r>
-        <w:rPr>
-          <w:rStyle w:val="FunctionTok"/>
-        </w:rPr>
-        <w:t xml:space="preserve">theme_minimal</w:t>
-      </w:r>
-      <w:r>
-        <w:rPr>
-          <w:rStyle w:val="NormalTok"/>
-        </w:rPr>
-        <w:t xml:space="preserve">(</w:t>
-      </w:r>
-      <w:r>
-        <w:rPr>
-          <w:rStyle w:val="AttributeTok"/>
-        </w:rPr>
-        <w:t xml:space="preserve">base_size =</w:t>
-      </w:r>
-      <w:r>
-        <w:rPr>
-          <w:rStyle w:val="NormalTok"/>
-        </w:rPr>
-        <w:t xml:space="preserve"> </w:t>
-      </w:r>
-      <w:r>
-        <w:rPr>
-          <w:rStyle w:val="DecValTok"/>
-        </w:rPr>
-        <w:t xml:space="preserve">12</w:t>
-      </w:r>
-      <w:r>
-        <w:rPr>
-          <w:rStyle w:val="NormalTok"/>
-        </w:rPr>
-        <w:t xml:space="preserve">) </w:t>
-      </w:r>
-      <w:r>
-        <w:rPr>
-          <w:rStyle w:val="SpecialCharTok"/>
-        </w:rPr>
-        <w:t xml:space="preserve">+</w:t>
-      </w:r>
-      <w:r>
-        <w:br/>
-      </w:r>
-      <w:r>
-        <w:rPr>
-          <w:rStyle w:val="NormalTok"/>
-        </w:rPr>
-        <w:t xml:space="preserve">  </w:t>
-      </w:r>
-      <w:r>
-        <w:rPr>
-          <w:rStyle w:val="FunctionTok"/>
-        </w:rPr>
-        <w:t xml:space="preserve">theme</w:t>
-      </w:r>
-      <w:r>
-        <w:rPr>
-          <w:rStyle w:val="NormalTok"/>
-        </w:rPr>
-        <w:t xml:space="preserve">(</w:t>
-      </w:r>
-      <w:r>
-        <w:br/>
-      </w:r>
-      <w:r>
-        <w:rPr>
-          <w:rStyle w:val="NormalTok"/>
-        </w:rPr>
-        <w:t xml:space="preserve">    </w:t>
-      </w:r>
-      <w:r>
-        <w:rPr>
-          <w:rStyle w:val="AttributeTok"/>
-        </w:rPr>
-        <w:t xml:space="preserve">plot.background =</w:t>
-      </w:r>
-      <w:r>
-        <w:rPr>
-          <w:rStyle w:val="NormalTok"/>
-        </w:rPr>
-        <w:t xml:space="preserve"> </w:t>
-      </w:r>
-      <w:r>
-        <w:rPr>
-          <w:rStyle w:val="FunctionTok"/>
-        </w:rPr>
-        <w:t xml:space="preserve">element_rect</w:t>
-      </w:r>
-      <w:r>
-        <w:rPr>
-          <w:rStyle w:val="NormalTok"/>
-        </w:rPr>
-        <w:t xml:space="preserve">(</w:t>
-      </w:r>
-      <w:r>
-        <w:rPr>
-          <w:rStyle w:val="AttributeTok"/>
-        </w:rPr>
-        <w:t xml:space="preserve">fill =</w:t>
-      </w:r>
-      <w:r>
-        <w:rPr>
-          <w:rStyle w:val="NormalTok"/>
-        </w:rPr>
-        <w:t xml:space="preserve"> </w:t>
-      </w:r>
-      <w:r>
-        <w:rPr>
-          <w:rStyle w:val="StringTok"/>
-        </w:rPr>
-        <w:t xml:space="preserve">"transparent"</w:t>
-      </w:r>
-      <w:r>
-        <w:rPr>
-          <w:rStyle w:val="NormalTok"/>
-        </w:rPr>
-        <w:t xml:space="preserve">, </w:t>
-      </w:r>
-      <w:r>
-        <w:rPr>
-          <w:rStyle w:val="AttributeTok"/>
-        </w:rPr>
-        <w:t xml:space="preserve">colour =</w:t>
-      </w:r>
-      <w:r>
-        <w:rPr>
-          <w:rStyle w:val="NormalTok"/>
-        </w:rPr>
-        <w:t xml:space="preserve"> </w:t>
-      </w:r>
-      <w:r>
-        <w:rPr>
-          <w:rStyle w:val="ConstantTok"/>
-        </w:rPr>
-        <w:t xml:space="preserve">NA</w:t>
-      </w:r>
-      <w:r>
-        <w:rPr>
-          <w:rStyle w:val="NormalTok"/>
-        </w:rPr>
-        <w:t xml:space="preserve">),</w:t>
-      </w:r>
-      <w:r>
-        <w:br/>
-      </w:r>
-      <w:r>
-        <w:rPr>
-          <w:rStyle w:val="NormalTok"/>
-        </w:rPr>
-        <w:t xml:space="preserve">    </w:t>
-      </w:r>
-      <w:r>
-        <w:rPr>
-          <w:rStyle w:val="AttributeTok"/>
-        </w:rPr>
-        <w:t xml:space="preserve">panel.background =</w:t>
-      </w:r>
-      <w:r>
-        <w:rPr>
-          <w:rStyle w:val="NormalTok"/>
-        </w:rPr>
-        <w:t xml:space="preserve"> </w:t>
-      </w:r>
-      <w:r>
-        <w:rPr>
-          <w:rStyle w:val="FunctionTok"/>
-        </w:rPr>
-        <w:t xml:space="preserve">element_rect</w:t>
-      </w:r>
-      <w:r>
-        <w:rPr>
-          <w:rStyle w:val="NormalTok"/>
-        </w:rPr>
-        <w:t xml:space="preserve">(</w:t>
-      </w:r>
-      <w:r>
-        <w:rPr>
-          <w:rStyle w:val="AttributeTok"/>
-        </w:rPr>
-        <w:t xml:space="preserve">fill =</w:t>
-      </w:r>
-      <w:r>
-        <w:rPr>
-          <w:rStyle w:val="NormalTok"/>
-        </w:rPr>
-        <w:t xml:space="preserve"> </w:t>
-      </w:r>
-      <w:r>
-        <w:rPr>
-          <w:rStyle w:val="StringTok"/>
-        </w:rPr>
-        <w:t xml:space="preserve">"transparent"</w:t>
-      </w:r>
-      <w:r>
-        <w:rPr>
-          <w:rStyle w:val="NormalTok"/>
-        </w:rPr>
-        <w:t xml:space="preserve">, </w:t>
-      </w:r>
-      <w:r>
-        <w:rPr>
-          <w:rStyle w:val="AttributeTok"/>
-        </w:rPr>
-        <w:t xml:space="preserve">colour =</w:t>
-      </w:r>
-      <w:r>
-        <w:rPr>
-          <w:rStyle w:val="NormalTok"/>
-        </w:rPr>
-        <w:t xml:space="preserve"> </w:t>
-      </w:r>
-      <w:r>
-        <w:rPr>
-          <w:rStyle w:val="ConstantTok"/>
-        </w:rPr>
-        <w:t xml:space="preserve">NA</w:t>
-      </w:r>
-      <w:r>
-        <w:rPr>
-          <w:rStyle w:val="NormalTok"/>
-        </w:rPr>
-        <w:t xml:space="preserve">),</w:t>
       </w:r>
       <w:r>
         <w:br/>

</xml_diff>

<commit_message>
Add interactive 3D R and Python Plotly charts with automatic One Dark Pro adaptation
</commit_message>
<xml_diff>
--- a/docs/exemple-article.docx
+++ b/docs/exemple-article.docx
@@ -163,7 +163,7 @@
         <w:t xml:space="preserve"> </w:t>
       </w:r>
       <w:r>
-        <w:t xml:space="preserve">regroupe les caractéristiques techniques de 32 modèles d’automobiles. Il permet d’illustrer la mise en forme des tableaux, des équations mathématiques, des encadrés et des graphiques adaptatifs en thème clair et sombre (One Dark Pro).</w:t>
+        <w:t xml:space="preserve">regroupe les caractéristiques techniques de 32 modèles d’automobiles. Il permet d’illustrer la mise en forme des tableaux, des équations mathématiques, des encadrés et des graphiques 2D et 3D interactifs adaptatifs en thème clair et sombre (One Dark Pro).</w:t>
       </w:r>
     </w:p>
     <w:tbl>
@@ -592,6 +592,39 @@
           <w:rStyle w:val="NormalTok"/>
         </w:rPr>
         <w:t xml:space="preserve">(</w:t>
+      </w:r>
+      <w:r>
+        <w:br/>
+      </w:r>
+      <w:r>
+        <w:rPr>
+          <w:rStyle w:val="NormalTok"/>
+        </w:rPr>
+        <w:t xml:space="preserve">    </w:t>
+      </w:r>
+      <w:r>
+        <w:rPr>
+          <w:rStyle w:val="AttributeTok"/>
+        </w:rPr>
+        <w:t xml:space="preserve">Modele =</w:t>
+      </w:r>
+      <w:r>
+        <w:rPr>
+          <w:rStyle w:val="NormalTok"/>
+        </w:rPr>
+        <w:t xml:space="preserve"> </w:t>
+      </w:r>
+      <w:r>
+        <w:rPr>
+          <w:rStyle w:val="FunctionTok"/>
+        </w:rPr>
+        <w:t xml:space="preserve">rownames</w:t>
+      </w:r>
+      <w:r>
+        <w:rPr>
+          <w:rStyle w:val="NormalTok"/>
+        </w:rPr>
+        <w:t xml:space="preserve">(mtcars),</w:t>
       </w:r>
       <w:r>
         <w:br/>

</xml_diff>